<commit_message>
multiple implementations and bugs fixes
</commit_message>
<xml_diff>
--- a/Pending.docx
+++ b/Pending.docx
@@ -233,7 +233,114 @@
       <w:r>
         <w:t xml:space="preserve"> expensive recalibration should not be started before this targeted recovery and sensitivity test.</w:t>
       </w:r>
-    </w:p>
+      <w:r>
+        <w:br/>
+      </w:r>
+    </w:p>
+    <w:p>
+      <w:r>
+        <w:br w:type="page"/>
+      </w:r>
+      <w:r>
+        <w:lastRenderedPageBreak/>
+        <w:t>The next correction should therefore be:</w:t>
+      </w:r>
+    </w:p>
+    <w:p>
+      <w:pPr>
+        <w:numPr>
+          <w:ilvl w:val="0"/>
+          <w:numId w:val="4"/>
+        </w:numPr>
+      </w:pPr>
+      <w:r>
+        <w:t>Keep the existing subgroup percentile normalization.</w:t>
+      </w:r>
+    </w:p>
+    <w:p>
+      <w:pPr>
+        <w:numPr>
+          <w:ilvl w:val="0"/>
+          <w:numId w:val="4"/>
+        </w:numPr>
+      </w:pPr>
+      <w:r>
+        <w:t>Add group-specific final component weights, not merely group-specific metric recipes.</w:t>
+      </w:r>
+    </w:p>
+    <w:p>
+      <w:pPr>
+        <w:numPr>
+          <w:ilvl w:val="0"/>
+          <w:numId w:val="4"/>
+        </w:numPr>
+      </w:pPr>
+      <w:r>
+        <w:t>Add specialized packs for asset-light logistics and parcel—or explicitly exclude those groups from specialized ranking.</w:t>
+      </w:r>
+    </w:p>
+    <w:p>
+      <w:pPr>
+        <w:numPr>
+          <w:ilvl w:val="0"/>
+          <w:numId w:val="4"/>
+        </w:numPr>
+      </w:pPr>
+      <w:r>
+        <w:t>Replace ineffective metric definitions such as operating-ratio level with economically appropriate changes or spreads.</w:t>
+      </w:r>
+    </w:p>
+    <w:p>
+      <w:pPr>
+        <w:numPr>
+          <w:ilvl w:val="0"/>
+          <w:numId w:val="4"/>
+        </w:numPr>
+      </w:pPr>
+      <w:r>
+        <w:t>Give tanker-cycle metrics meaningful weight; fleet age at 2.5% is not a real tanker-specialized model.</w:t>
+      </w:r>
+    </w:p>
+    <w:p>
+      <w:pPr>
+        <w:numPr>
+          <w:ilvl w:val="0"/>
+          <w:numId w:val="4"/>
+        </w:numPr>
+      </w:pPr>
+      <w:r>
+        <w:t>Evaluate and gate each comparison group separately before aggregating them into the surface portfolio.</w:t>
+      </w:r>
+    </w:p>
+    <w:p>
+      <w:pPr>
+        <w:numPr>
+          <w:ilvl w:val="0"/>
+          <w:numId w:val="4"/>
+        </w:numPr>
+        <w:rPr>
+          <w:b/>
+          <w:bCs/>
+        </w:rPr>
+      </w:pPr>
+      <w:r>
+        <w:t>Aggregate subgroup scores using fixed, outcome-blind group weights so large groups do not dominate selection.</w:t>
+      </w:r>
+      <w:r>
+        <w:br/>
+      </w:r>
+      <w:r>
+        <w:br/>
+      </w:r>
+      <w:r>
+        <w:rPr>
+          <w:b/>
+          <w:bCs/>
+        </w:rPr>
+        <w:t>Tech recalibration</w:t>
+      </w:r>
+    </w:p>
+    <w:p/>
     <w:p/>
     <w:sectPr>
       <w:pgSz w:w="12240" w:h="15840"/>
@@ -248,6 +355,119 @@
 <file path=word/numbering.xml><?xml version="1.0" encoding="utf-8"?>
 <w:numbering xmlns:wpc="http://schemas.microsoft.com/office/word/2010/wordprocessingCanvas" xmlns:cx="http://schemas.microsoft.com/office/drawing/2014/chartex" xmlns:cx1="http://schemas.microsoft.com/office/drawing/2015/9/8/chartex" xmlns:cx2="http://schemas.microsoft.com/office/drawing/2015/10/21/chartex" xmlns:cx3="http://schemas.microsoft.com/office/drawing/2016/5/9/chartex" xmlns:cx4="http://schemas.microsoft.com/office/drawing/2016/5/10/chartex" xmlns:cx5="http://schemas.microsoft.com/office/drawing/2016/5/11/chartex" xmlns:cx6="http://schemas.microsoft.com/office/drawing/2016/5/12/chartex" xmlns:cx7="http://schemas.microsoft.com/office/drawing/2016/5/13/chartex" xmlns:cx8="http://schemas.microsoft.com/office/drawing/2016/5/14/chartex" xmlns:mc="http://schemas.openxmlformats.org/markup-compatibility/2006" xmlns:aink="http://schemas.microsoft.com/office/drawing/2016/ink" xmlns:am3d="http://schemas.microsoft.com/office/drawing/2017/model3d" xmlns:o="urn:schemas-microsoft-com:office:office" xmlns:oel="http://schemas.microsoft.com/office/2019/extlst" xmlns:r="http://schemas.openxmlformats.org/officeDocument/2006/relationships" xmlns:m="http://schemas.openxmlformats.org/officeDocument/2006/math" xmlns:v="urn:schemas-microsoft-com:vml" xmlns:wp14="http://schemas.microsoft.com/office/word/2010/wordprocessingDrawing" xmlns:wp="http://schemas.openxmlformats.org/drawingml/2006/wordprocessingDrawing" xmlns:w10="urn:schemas-microsoft-com:office:word" xmlns:w="http://schemas.openxmlformats.org/wordprocessingml/2006/main" xmlns:w14="http://schemas.microsoft.com/office/word/2010/wordml" xmlns:w15="http://schemas.microsoft.com/office/word/2012/wordml" xmlns:w16cei="http://schemas.microsoft.com/office/word/2026/wordml/cei" xmlns:w16cex="http://schemas.microsoft.com/office/word/2018/wordml/cex" xmlns:w16cid="http://schemas.microsoft.com/office/word/2016/wordml/cid" xmlns:w16="http://schemas.microsoft.com/office/word/2018/wordml" xmlns:w16du="http://schemas.microsoft.com/office/word/2023/wordml/word16du" xmlns:w16sdtdh="http://schemas.microsoft.com/office/word/2020/wordml/sdtdatahash" xmlns:w16sdtfl="http://schemas.microsoft.com/office/word/2024/wordml/sdtformatlock" xmlns:w16se="http://schemas.microsoft.com/office/word/2015/wordml/symex" xmlns:wpg="http://schemas.microsoft.com/office/word/2010/wordprocessingGroup" xmlns:wpi="http://schemas.microsoft.com/office/word/2010/wordprocessingInk" xmlns:wne="http://schemas.microsoft.com/office/word/2006/wordml" xmlns:wps="http://schemas.microsoft.com/office/word/2010/wordprocessingShape" mc:Ignorable="w14 w15 w16se w16cid w16 w16cex w16sdtdh w16sdtfl w16du wp14">
   <w:abstractNum w:abstractNumId="0" w15:restartNumberingAfterBreak="0">
+    <w:nsid w:val="24F468DD"/>
+    <w:multiLevelType w:val="multilevel"/>
+    <w:tmpl w:val="503C6A70"/>
+    <w:lvl w:ilvl="0">
+      <w:start w:val="1"/>
+      <w:numFmt w:val="decimal"/>
+      <w:lvlText w:val="%1."/>
+      <w:lvlJc w:val="left"/>
+      <w:pPr>
+        <w:tabs>
+          <w:tab w:val="num" w:pos="720"/>
+        </w:tabs>
+        <w:ind w:left="720" w:hanging="360"/>
+      </w:pPr>
+    </w:lvl>
+    <w:lvl w:ilvl="1" w:tentative="1">
+      <w:start w:val="1"/>
+      <w:numFmt w:val="decimal"/>
+      <w:lvlText w:val="%2."/>
+      <w:lvlJc w:val="left"/>
+      <w:pPr>
+        <w:tabs>
+          <w:tab w:val="num" w:pos="1440"/>
+        </w:tabs>
+        <w:ind w:left="1440" w:hanging="360"/>
+      </w:pPr>
+    </w:lvl>
+    <w:lvl w:ilvl="2" w:tentative="1">
+      <w:start w:val="1"/>
+      <w:numFmt w:val="decimal"/>
+      <w:lvlText w:val="%3."/>
+      <w:lvlJc w:val="left"/>
+      <w:pPr>
+        <w:tabs>
+          <w:tab w:val="num" w:pos="2160"/>
+        </w:tabs>
+        <w:ind w:left="2160" w:hanging="360"/>
+      </w:pPr>
+    </w:lvl>
+    <w:lvl w:ilvl="3" w:tentative="1">
+      <w:start w:val="1"/>
+      <w:numFmt w:val="decimal"/>
+      <w:lvlText w:val="%4."/>
+      <w:lvlJc w:val="left"/>
+      <w:pPr>
+        <w:tabs>
+          <w:tab w:val="num" w:pos="2880"/>
+        </w:tabs>
+        <w:ind w:left="2880" w:hanging="360"/>
+      </w:pPr>
+    </w:lvl>
+    <w:lvl w:ilvl="4" w:tentative="1">
+      <w:start w:val="1"/>
+      <w:numFmt w:val="decimal"/>
+      <w:lvlText w:val="%5."/>
+      <w:lvlJc w:val="left"/>
+      <w:pPr>
+        <w:tabs>
+          <w:tab w:val="num" w:pos="3600"/>
+        </w:tabs>
+        <w:ind w:left="3600" w:hanging="360"/>
+      </w:pPr>
+    </w:lvl>
+    <w:lvl w:ilvl="5" w:tentative="1">
+      <w:start w:val="1"/>
+      <w:numFmt w:val="decimal"/>
+      <w:lvlText w:val="%6."/>
+      <w:lvlJc w:val="left"/>
+      <w:pPr>
+        <w:tabs>
+          <w:tab w:val="num" w:pos="4320"/>
+        </w:tabs>
+        <w:ind w:left="4320" w:hanging="360"/>
+      </w:pPr>
+    </w:lvl>
+    <w:lvl w:ilvl="6" w:tentative="1">
+      <w:start w:val="1"/>
+      <w:numFmt w:val="decimal"/>
+      <w:lvlText w:val="%7."/>
+      <w:lvlJc w:val="left"/>
+      <w:pPr>
+        <w:tabs>
+          <w:tab w:val="num" w:pos="5040"/>
+        </w:tabs>
+        <w:ind w:left="5040" w:hanging="360"/>
+      </w:pPr>
+    </w:lvl>
+    <w:lvl w:ilvl="7" w:tentative="1">
+      <w:start w:val="1"/>
+      <w:numFmt w:val="decimal"/>
+      <w:lvlText w:val="%8."/>
+      <w:lvlJc w:val="left"/>
+      <w:pPr>
+        <w:tabs>
+          <w:tab w:val="num" w:pos="5760"/>
+        </w:tabs>
+        <w:ind w:left="5760" w:hanging="360"/>
+      </w:pPr>
+    </w:lvl>
+    <w:lvl w:ilvl="8" w:tentative="1">
+      <w:start w:val="1"/>
+      <w:numFmt w:val="decimal"/>
+      <w:lvlText w:val="%9."/>
+      <w:lvlJc w:val="left"/>
+      <w:pPr>
+        <w:tabs>
+          <w:tab w:val="num" w:pos="6480"/>
+        </w:tabs>
+        <w:ind w:left="6480" w:hanging="360"/>
+      </w:pPr>
+    </w:lvl>
+  </w:abstractNum>
+  <w:abstractNum w:abstractNumId="1" w15:restartNumberingAfterBreak="0">
     <w:nsid w:val="3785346F"/>
     <w:multiLevelType w:val="multilevel"/>
     <w:tmpl w:val="8CDC52C6"/>
@@ -364,7 +584,7 @@
       </w:pPr>
     </w:lvl>
   </w:abstractNum>
-  <w:abstractNum w:abstractNumId="1" w15:restartNumberingAfterBreak="0">
+  <w:abstractNum w:abstractNumId="2" w15:restartNumberingAfterBreak="0">
     <w:nsid w:val="4C995E53"/>
     <w:multiLevelType w:val="multilevel"/>
     <w:tmpl w:val="B76661CC"/>
@@ -513,7 +733,7 @@
       </w:rPr>
     </w:lvl>
   </w:abstractNum>
-  <w:abstractNum w:abstractNumId="2" w15:restartNumberingAfterBreak="0">
+  <w:abstractNum w:abstractNumId="3" w15:restartNumberingAfterBreak="0">
     <w:nsid w:val="69886046"/>
     <w:multiLevelType w:val="multilevel"/>
     <w:tmpl w:val="482AF98E"/>
@@ -627,13 +847,16 @@
     </w:lvl>
   </w:abstractNum>
   <w:num w:numId="1" w16cid:durableId="1883707538">
-    <w:abstractNumId w:val="0"/>
+    <w:abstractNumId w:val="1"/>
   </w:num>
   <w:num w:numId="2" w16cid:durableId="801968808">
-    <w:abstractNumId w:val="1"/>
+    <w:abstractNumId w:val="2"/>
   </w:num>
   <w:num w:numId="3" w16cid:durableId="853031157">
-    <w:abstractNumId w:val="2"/>
+    <w:abstractNumId w:val="3"/>
+  </w:num>
+  <w:num w:numId="4" w16cid:durableId="1604415077">
+    <w:abstractNumId w:val="0"/>
   </w:num>
 </w:numbering>
 </file>

</xml_diff>